<commit_message>
Literature Review update along with rephrasing of Ground Truth
</commit_message>
<xml_diff>
--- a/Applied-Research Project/03-Literature-Review/04_Literature_Drafts/Literature_Review_Draft_Update_08-10.docx
+++ b/Applied-Research Project/03-Literature-Review/04_Literature_Drafts/Literature_Review_Draft_Update_08-10.docx
@@ -194,9 +194,12 @@
         <w:jc w:val="center"/>
         <w:rPr>
           <w:rFonts w:ascii="Calibri" w:eastAsia="Calibri" w:hAnsi="Calibri" w:cs="Calibri"/>
+          <w:b/>
+          <w:bCs/>
           <w:kern w:val="0"/>
-          <w:sz w:val="44"/>
-          <w:szCs w:val="44"/>
+          <w:sz w:val="46"/>
+          <w:szCs w:val="46"/>
+          <w:u w:val="single"/>
           <w:lang w:val="en-US" w:eastAsia="ja-JP"/>
           <w14:ligatures w14:val="none"/>
         </w:rPr>
@@ -213,9 +216,12 @@
       <w:r>
         <w:rPr>
           <w:rFonts w:ascii="Calibri" w:eastAsia="Calibri" w:hAnsi="Calibri" w:cs="Calibri"/>
+          <w:b/>
+          <w:bCs/>
           <w:kern w:val="0"/>
-          <w:sz w:val="44"/>
-          <w:szCs w:val="44"/>
+          <w:sz w:val="46"/>
+          <w:szCs w:val="46"/>
+          <w:u w:val="single"/>
           <w:lang w:val="en-US" w:eastAsia="ja-JP"/>
           <w14:ligatures w14:val="none"/>
         </w:rPr>
@@ -228,9 +234,12 @@
         <w:jc w:val="center"/>
         <w:rPr>
           <w:rFonts w:ascii="Calibri" w:eastAsia="Calibri" w:hAnsi="Calibri" w:cs="Calibri"/>
+          <w:b/>
+          <w:bCs/>
           <w:kern w:val="0"/>
-          <w:sz w:val="44"/>
-          <w:szCs w:val="44"/>
+          <w:sz w:val="46"/>
+          <w:szCs w:val="46"/>
+          <w:u w:val="single"/>
           <w:lang w:val="en-US" w:eastAsia="ja-JP"/>
           <w14:ligatures w14:val="none"/>
         </w:rPr>
@@ -238,9 +247,12 @@
       <w:r>
         <w:rPr>
           <w:rFonts w:ascii="Calibri" w:eastAsia="Calibri" w:hAnsi="Calibri" w:cs="Calibri"/>
+          <w:b/>
+          <w:bCs/>
           <w:kern w:val="0"/>
-          <w:sz w:val="44"/>
-          <w:szCs w:val="44"/>
+          <w:sz w:val="46"/>
+          <w:szCs w:val="46"/>
+          <w:u w:val="single"/>
           <w:lang w:val="en-US" w:eastAsia="ja-JP"/>
           <w14:ligatures w14:val="none"/>
         </w:rPr>
@@ -253,9 +265,12 @@
         <w:jc w:val="center"/>
         <w:rPr>
           <w:rFonts w:ascii="Calibri" w:eastAsia="Calibri" w:hAnsi="Calibri" w:cs="Calibri"/>
+          <w:b/>
+          <w:bCs/>
           <w:kern w:val="0"/>
-          <w:sz w:val="44"/>
-          <w:szCs w:val="44"/>
+          <w:sz w:val="46"/>
+          <w:szCs w:val="46"/>
+          <w:u w:val="single"/>
           <w:lang w:val="en-US" w:eastAsia="ja-JP"/>
           <w14:ligatures w14:val="none"/>
         </w:rPr>
@@ -263,9 +278,12 @@
       <w:r>
         <w:rPr>
           <w:rFonts w:ascii="Calibri" w:eastAsia="Calibri" w:hAnsi="Calibri" w:cs="Calibri"/>
+          <w:b/>
+          <w:bCs/>
           <w:kern w:val="0"/>
-          <w:sz w:val="44"/>
-          <w:szCs w:val="44"/>
+          <w:sz w:val="46"/>
+          <w:szCs w:val="46"/>
+          <w:u w:val="single"/>
           <w:lang w:val="en-US" w:eastAsia="ja-JP"/>
           <w14:ligatures w14:val="none"/>
         </w:rPr>
@@ -278,9 +296,12 @@
         <w:jc w:val="center"/>
         <w:rPr>
           <w:rFonts w:ascii="Calibri" w:eastAsia="Calibri" w:hAnsi="Calibri" w:cs="Calibri"/>
+          <w:b/>
+          <w:bCs/>
           <w:kern w:val="0"/>
-          <w:sz w:val="44"/>
-          <w:szCs w:val="44"/>
+          <w:sz w:val="46"/>
+          <w:szCs w:val="46"/>
+          <w:u w:val="single"/>
           <w:lang w:val="en-US" w:eastAsia="ja-JP"/>
           <w14:ligatures w14:val="none"/>
         </w:rPr>
@@ -288,13 +309,46 @@
       <w:r>
         <w:rPr>
           <w:rFonts w:ascii="Calibri" w:eastAsia="Calibri" w:hAnsi="Calibri" w:cs="Calibri"/>
+          <w:b/>
+          <w:bCs/>
           <w:kern w:val="0"/>
-          <w:sz w:val="44"/>
-          <w:szCs w:val="44"/>
+          <w:sz w:val="46"/>
+          <w:szCs w:val="46"/>
+          <w:u w:val="single"/>
           <w:lang w:val="en-US" w:eastAsia="ja-JP"/>
           <w14:ligatures w14:val="none"/>
         </w:rPr>
-        <w:t>Investigation Using Wazuh and</w:t>
+        <w:t xml:space="preserve">Investigation Using </w:t>
+      </w:r>
+      <w:proofErr w:type="spellStart"/>
+      <w:r>
+        <w:rPr>
+          <w:rFonts w:ascii="Calibri" w:eastAsia="Calibri" w:hAnsi="Calibri" w:cs="Calibri"/>
+          <w:b/>
+          <w:bCs/>
+          <w:kern w:val="0"/>
+          <w:sz w:val="46"/>
+          <w:szCs w:val="46"/>
+          <w:u w:val="single"/>
+          <w:lang w:val="en-US" w:eastAsia="ja-JP"/>
+          <w14:ligatures w14:val="none"/>
+        </w:rPr>
+        <w:t>Wazuh</w:t>
+      </w:r>
+      <w:proofErr w:type="spellEnd"/>
+      <w:r>
+        <w:rPr>
+          <w:rFonts w:ascii="Calibri" w:eastAsia="Calibri" w:hAnsi="Calibri" w:cs="Calibri"/>
+          <w:b/>
+          <w:bCs/>
+          <w:kern w:val="0"/>
+          <w:sz w:val="46"/>
+          <w:szCs w:val="46"/>
+          <w:u w:val="single"/>
+          <w:lang w:val="en-US" w:eastAsia="ja-JP"/>
+          <w14:ligatures w14:val="none"/>
+        </w:rPr>
+        <w:t xml:space="preserve"> and</w:t>
       </w:r>
     </w:p>
     <w:p>
@@ -303,9 +357,12 @@
         <w:jc w:val="center"/>
         <w:rPr>
           <w:rFonts w:ascii="Calibri" w:eastAsia="Calibri" w:hAnsi="Calibri" w:cs="Calibri"/>
+          <w:b/>
+          <w:bCs/>
           <w:kern w:val="0"/>
-          <w:sz w:val="44"/>
-          <w:szCs w:val="44"/>
+          <w:sz w:val="46"/>
+          <w:szCs w:val="46"/>
+          <w:u w:val="single"/>
           <w:lang w:val="en-US" w:eastAsia="ja-JP"/>
           <w14:ligatures w14:val="none"/>
         </w:rPr>
@@ -313,9 +370,12 @@
       <w:r>
         <w:rPr>
           <w:rFonts w:ascii="Calibri" w:eastAsia="Calibri" w:hAnsi="Calibri" w:cs="Calibri"/>
+          <w:b/>
+          <w:bCs/>
           <w:kern w:val="0"/>
-          <w:sz w:val="44"/>
-          <w:szCs w:val="44"/>
+          <w:sz w:val="46"/>
+          <w:szCs w:val="46"/>
+          <w:u w:val="single"/>
           <w:lang w:val="en-US" w:eastAsia="ja-JP"/>
           <w14:ligatures w14:val="none"/>
         </w:rPr>
@@ -750,7 +810,25 @@
           <w:color w:val="333333"/>
           <w:sz w:val="20"/>
         </w:rPr>
-        <w:t>2.4 Wazuh and Sysmon as Security Evidence Sources</w:t>
+        <w:t xml:space="preserve">2.4 </w:t>
+      </w:r>
+      <w:proofErr w:type="spellStart"/>
+      <w:r>
+        <w:rPr>
+          <w:rFonts w:ascii="Calibri" w:eastAsia="Georgia" w:hAnsi="Calibri" w:cs="Calibri"/>
+          <w:color w:val="333333"/>
+          <w:sz w:val="20"/>
+        </w:rPr>
+        <w:t>Wazuh</w:t>
+      </w:r>
+      <w:proofErr w:type="spellEnd"/>
+      <w:r>
+        <w:rPr>
+          <w:rFonts w:ascii="Calibri" w:eastAsia="Georgia" w:hAnsi="Calibri" w:cs="Calibri"/>
+          <w:color w:val="333333"/>
+          <w:sz w:val="20"/>
+        </w:rPr>
+        <w:t xml:space="preserve"> and Sysmon as Security Evidence Sources</w:t>
       </w:r>
     </w:p>
     <w:p>
@@ -1024,7 +1102,25 @@
           <w:color w:val="333333"/>
           <w:sz w:val="20"/>
         </w:rPr>
-        <w:t>4.2 Wazuh Configuration</w:t>
+        <w:t xml:space="preserve">4.2 </w:t>
+      </w:r>
+      <w:proofErr w:type="spellStart"/>
+      <w:r>
+        <w:rPr>
+          <w:rFonts w:ascii="Calibri" w:eastAsia="Georgia" w:hAnsi="Calibri" w:cs="Calibri"/>
+          <w:color w:val="333333"/>
+          <w:sz w:val="20"/>
+        </w:rPr>
+        <w:t>Wazuh</w:t>
+      </w:r>
+      <w:proofErr w:type="spellEnd"/>
+      <w:r>
+        <w:rPr>
+          <w:rFonts w:ascii="Calibri" w:eastAsia="Georgia" w:hAnsi="Calibri" w:cs="Calibri"/>
+          <w:color w:val="333333"/>
+          <w:sz w:val="20"/>
+        </w:rPr>
+        <w:t xml:space="preserve"> Configuration</w:t>
       </w:r>
     </w:p>
     <w:p>
@@ -1425,7 +1521,25 @@
           <w:color w:val="333333"/>
           <w:sz w:val="20"/>
         </w:rPr>
-        <w:t>6.4 Comparison With Previous Literature</w:t>
+        <w:t xml:space="preserve">6.4 Comparison </w:t>
+      </w:r>
+      <w:proofErr w:type="gramStart"/>
+      <w:r>
+        <w:rPr>
+          <w:rFonts w:ascii="Calibri" w:eastAsia="Georgia" w:hAnsi="Calibri" w:cs="Calibri"/>
+          <w:color w:val="333333"/>
+          <w:sz w:val="20"/>
+        </w:rPr>
+        <w:t>With</w:t>
+      </w:r>
+      <w:proofErr w:type="gramEnd"/>
+      <w:r>
+        <w:rPr>
+          <w:rFonts w:ascii="Calibri" w:eastAsia="Georgia" w:hAnsi="Calibri" w:cs="Calibri"/>
+          <w:color w:val="333333"/>
+          <w:sz w:val="20"/>
+        </w:rPr>
+        <w:t xml:space="preserve"> Previous Literature</w:t>
       </w:r>
     </w:p>
     <w:p>
@@ -1896,7 +2010,23 @@
         <w:rPr>
           <w:rFonts w:ascii="Calibri" w:hAnsi="Calibri" w:cs="Calibri"/>
         </w:rPr>
-        <w:t xml:space="preserve"> events that may otherwise need to be reviewed manually. In my view, this is one of the main reasons LLMs are becoming increasingly relevant within SOCs, as their value is not limited to producing summaries but also includes helping to organise and interpret complex security information. Cadet et al. (2026) demonstrates how LLM-based approaches can support the reconstruction of incidents using evidence from multiple log sources. Security incidents are rarely represented by a </w:t>
+        <w:t xml:space="preserve"> events that may otherwise need to be reviewed manually. In my view, this is one of the main reasons LLMs are becoming increasingly relevant within SOCs, as their value is not limited to producing summaries but also includes helping to organise and interpret complex security information. Cadet et al. (2026) demonstrates how LLM-based approaches can support the reconstruction of incidents using evidence from multiple log sources. Security incidents are rarely represented by </w:t>
+      </w:r>
+      <w:proofErr w:type="spellStart"/>
+      <w:proofErr w:type="gramStart"/>
+      <w:r>
+        <w:rPr>
+          <w:rFonts w:ascii="Calibri" w:hAnsi="Calibri" w:cs="Calibri"/>
+        </w:rPr>
+        <w:t>a</w:t>
+      </w:r>
+      <w:proofErr w:type="spellEnd"/>
+      <w:proofErr w:type="gramEnd"/>
+      <w:r>
+        <w:rPr>
+          <w:rFonts w:ascii="Calibri" w:hAnsi="Calibri" w:cs="Calibri"/>
+        </w:rPr>
+        <w:t xml:space="preserve"> </w:t>
       </w:r>
       <w:r>
         <w:rPr>
@@ -2105,6 +2235,7 @@
         </w:rPr>
         <w:t xml:space="preserve">2.2 </w:t>
       </w:r>
+      <w:proofErr w:type="spellStart"/>
       <w:r>
         <w:rPr>
           <w:rFonts w:ascii="Calibri" w:hAnsi="Calibri" w:cs="Calibri"/>
@@ -2114,11 +2245,10 @@
           <w:szCs w:val="28"/>
           <w:u w:val="single"/>
         </w:rPr>
-        <w:t>Wazuh and Sysmon as Security Evidence Sources</w:t>
-      </w:r>
-    </w:p>
-    <w:p>
-      <w:pPr>
+        <w:t>Wazuh</w:t>
+      </w:r>
+      <w:proofErr w:type="spellEnd"/>
+      <w:r>
         <w:rPr>
           <w:rFonts w:ascii="Calibri" w:hAnsi="Calibri" w:cs="Calibri"/>
           <w:b/>
@@ -2127,8 +2257,11 @@
           <w:szCs w:val="28"/>
           <w:u w:val="single"/>
         </w:rPr>
-      </w:pPr>
-      <w:r>
+        <w:t xml:space="preserve"> and Sysmon as Security Evidence Sources</w:t>
+      </w:r>
+    </w:p>
+    <w:p>
+      <w:pPr>
         <w:rPr>
           <w:rFonts w:ascii="Calibri" w:hAnsi="Calibri" w:cs="Calibri"/>
           <w:b/>
@@ -2137,6 +2270,16 @@
           <w:szCs w:val="28"/>
           <w:u w:val="single"/>
         </w:rPr>
+      </w:pPr>
+      <w:r>
+        <w:rPr>
+          <w:rFonts w:ascii="Calibri" w:hAnsi="Calibri" w:cs="Calibri"/>
+          <w:b/>
+          <w:bCs/>
+          <w:sz w:val="28"/>
+          <w:szCs w:val="28"/>
+          <w:u w:val="single"/>
+        </w:rPr>
         <w:t>2.5 Ground Truth and Evaluation of LLM Performance</w:t>
       </w:r>
     </w:p>
@@ -2174,7 +2317,27 @@
         <w:rPr>
           <w:rFonts w:ascii="Calibri" w:hAnsi="Calibri" w:cs="Calibri"/>
         </w:rPr>
-        <w:t xml:space="preserve">Balogh et al. (2024) identified analyst expertise as an important consideration when comparing LLM performance with human analysts, suggesting that differences in technical experience could influence the results. Schaermer (2026) similarly criticises a previous human-versus-LLM study because it did not report the qualifications of the SOC analysts, such as their years of experience or certifications. In my view, this makes it difficult to determine whether differences in performance are attributable to the capability of the LLM or to the experience of the analyst used for comparison. </w:t>
+        <w:t xml:space="preserve">Balogh et al. (2024) identified analyst expertise as an important consideration when comparing LLM performance with human analysts, suggesting that differences in technical experience could influence the results. </w:t>
+      </w:r>
+      <w:r>
+        <w:rPr>
+          <w:rFonts w:ascii="Calibri" w:hAnsi="Calibri" w:cs="Calibri"/>
+        </w:rPr>
+        <w:t xml:space="preserve">Additionally, </w:t>
+      </w:r>
+      <w:proofErr w:type="spellStart"/>
+      <w:r>
+        <w:rPr>
+          <w:rFonts w:ascii="Calibri" w:hAnsi="Calibri" w:cs="Calibri"/>
+        </w:rPr>
+        <w:t>Schaermer</w:t>
+      </w:r>
+      <w:proofErr w:type="spellEnd"/>
+      <w:r>
+        <w:rPr>
+          <w:rFonts w:ascii="Calibri" w:hAnsi="Calibri" w:cs="Calibri"/>
+        </w:rPr>
+        <w:t xml:space="preserve"> (2026) similarly criticises a previous human-versus-LLM study because it did not report the qualifications of the SOC analysts, such as their years of experience or certifications. In my view, this makes it difficult to determine whether differences in performance are attributable to the capability of the LLM or to the experience of the analyst used for comparison. </w:t>
       </w:r>
       <w:r>
         <w:rPr>
@@ -2192,7 +2355,21 @@
         <w:rPr>
           <w:rFonts w:ascii="Calibri" w:hAnsi="Calibri" w:cs="Calibri"/>
         </w:rPr>
-        <w:t xml:space="preserve"> considerably between individuals, this project evaluates each LLM against independently created ground truth. Schaermer (2026, p. 24)</w:t>
+        <w:t xml:space="preserve"> considerably between individuals, this project evaluates each LLM against independently created ground truth. </w:t>
+      </w:r>
+      <w:proofErr w:type="spellStart"/>
+      <w:r>
+        <w:rPr>
+          <w:rFonts w:ascii="Calibri" w:hAnsi="Calibri" w:cs="Calibri"/>
+        </w:rPr>
+        <w:t>Schaermer</w:t>
+      </w:r>
+      <w:proofErr w:type="spellEnd"/>
+      <w:r>
+        <w:rPr>
+          <w:rFonts w:ascii="Calibri" w:hAnsi="Calibri" w:cs="Calibri"/>
+        </w:rPr>
+        <w:t xml:space="preserve"> (2026, p. 24)</w:t>
       </w:r>
       <w:r>
         <w:rPr>
@@ -2929,6 +3106,7 @@
   <w:style w:type="character" w:default="1" w:styleId="DefaultParagraphFont">
     <w:name w:val="Default Paragraph Font"/>
     <w:uiPriority w:val="1"/>
+    <w:semiHidden/>
     <w:unhideWhenUsed/>
   </w:style>
   <w:style w:type="table" w:default="1" w:styleId="TableNormal">

</xml_diff>